<commit_message>
Posten und historische Belege nur noch indirekt beschreibbar
Grossbuchstaben sind ein direktes, Kleinbuchstaben ein indirektes Recht. Die
Berechtigungssaetze vergeben auf Provisionsposten, Buch.-Blattzeile und
gebuchte Softwareanpassung nur noch indirekte Schreibrechte; das direkte
Recht bringen die Buchungsroutinen ueber ihre Permissions-Eigenschaft mit.

Damit laesst sich ein Posten oder ein historischer Beleg nur noch ueber die
Buchung erzeugen, nicht mehr ueber eine Page, einen Report oder ein
Konfigurationspaket. Aendern und Loeschen ist auf diesen drei Tabellen
nirgends mehr vergeben, auch nicht im Vollzugriff.

Das Berechtigungskonzept ist entsprechend nachgezogen; es unterschied bisher
nicht zwischen direktem und indirektem Recht.

Co-Authored-By: Claude Opus 5 <noreply@anthropic.com>
Claude-Session: https://claude.ai/code/session_013MM1vTp47hUMp53hK3ZxA8
</commit_message>
<xml_diff>
--- a/docs/Berechtigungskonzept.docx
+++ b/docs/Berechtigungskonzept.docx
@@ -2290,6 +2290,23 @@
     </w:p>
     <w:p>
       <w:pPr>
+        <w:spacing w:after="120" w:line="276"/>
+      </w:pPr>
+      <w:r>
+        <w:rPr>
+          <w:rFonts w:ascii="Calibri" w:cs="Calibri" w:eastAsia="Calibri" w:hAnsi="Calibri"/>
+          <w:b w:val="false"/>
+          <w:bCs w:val="false"/>
+          <w:i w:val="false"/>
+          <w:iCs w:val="false"/>
+          <w:sz w:val="21"/>
+          <w:szCs w:val="21"/>
+        </w:rPr>
+        <w:t xml:space="preserve">Die Schreibweise ist bedeutungstragend: Großbuchstaben stehen für ein direktes Recht, Kleinbuchstaben für ein indirektes. Ein indirektes Recht greift nur, während eine Codeunit läuft, die das Recht über ihre Permissions-Eigenschaft mitbringt. Rimd bedeutet also: lesen darf der Benutzer selbst, schreiben nur die Buchungsroutine in seinem Namen.</w:t>
+      </w:r>
+    </w:p>
+    <w:p>
+      <w:pPr>
         <w:pStyle w:val="Heading2"/>
         <w:spacing w:after="120" w:before="260"/>
       </w:pPr>
@@ -3236,7 +3253,7 @@
                 <w:sz w:val="19"/>
                 <w:szCs w:val="19"/>
               </w:rPr>
-              <w:t xml:space="preserve">RIMD</w:t>
+              <w:t xml:space="preserve">Rimd</w:t>
             </w:r>
           </w:p>
         </w:tc>
@@ -3290,7 +3307,7 @@
                 <w:sz w:val="19"/>
                 <w:szCs w:val="19"/>
               </w:rPr>
-              <w:t xml:space="preserve">RIMD</w:t>
+              <w:t xml:space="preserve">Rimd</w:t>
             </w:r>
           </w:p>
         </w:tc>
@@ -3403,7 +3420,7 @@
                 <w:sz w:val="19"/>
                 <w:szCs w:val="19"/>
               </w:rPr>
-              <w:t xml:space="preserve">RI</w:t>
+              <w:t xml:space="preserve">Ri</w:t>
             </w:r>
           </w:p>
         </w:tc>
@@ -3459,7 +3476,7 @@
                 <w:sz w:val="19"/>
                 <w:szCs w:val="19"/>
               </w:rPr>
-              <w:t xml:space="preserve">RI</w:t>
+              <w:t xml:space="preserve">Ri</w:t>
             </w:r>
           </w:p>
         </w:tc>
@@ -4274,7 +4291,7 @@
                 <w:sz w:val="19"/>
                 <w:szCs w:val="19"/>
               </w:rPr>
-              <w:t xml:space="preserve">RIMD</w:t>
+              <w:t xml:space="preserve">Ri</w:t>
             </w:r>
           </w:p>
         </w:tc>
@@ -4330,7 +4347,7 @@
                 <w:sz w:val="19"/>
                 <w:szCs w:val="19"/>
               </w:rPr>
-              <w:t xml:space="preserve">RI</w:t>
+              <w:t xml:space="preserve">Ri</w:t>
             </w:r>
           </w:p>
         </w:tc>
@@ -6320,7 +6337,25 @@
           <w:sz w:val="21"/>
           <w:szCs w:val="21"/>
         </w:rPr>
-        <w:t xml:space="preserve">Provisionsposten lassen sich in keinem Berechtigungssatz ändern oder löschen. Vergeben ist höchstens RI. Das entspricht der fachlichen Vorgabe, dass Provisionsposten dauerhaft erhalten bleiben.</w:t>
+        <w:t xml:space="preserve">Provisionsposten, Buch.-Blattzeilen und gebuchte Softwareanpassungen sind ausschließlich indirekt beschreibbar. Kein Benutzer kann sie über eine Page, einen Report oder eine Konfigurationspaket-Migration anlegen oder ändern – nur die Buchungsroutinen tun das, und zwar über ihre Permissions-Eigenschaft.</w:t>
+      </w:r>
+    </w:p>
+    <w:p>
+      <w:pPr>
+        <w:pStyle w:val="ListParagraph"/>
+        <w:numPr>
+          <w:ilvl w:val="0"/>
+          <w:numId w:val="1"/>
+        </w:numPr>
+        <w:spacing w:after="80" w:line="276"/>
+      </w:pPr>
+      <w:r>
+        <w:rPr>
+          <w:rFonts w:ascii="Calibri" w:cs="Calibri" w:eastAsia="Calibri" w:hAnsi="Calibri"/>
+          <w:sz w:val="21"/>
+          <w:szCs w:val="21"/>
+        </w:rPr>
+        <w:t xml:space="preserve">Ändern und Löschen ist auf diesen drei Tabellen in keinem Satz vergeben, auch nicht indirekt und auch nicht im Vollzugriff. Provisionsposten und historische Belege bleiben damit dauerhaft erhalten, wie es die Spezifikation verlangt.</w:t>
       </w:r>
     </w:p>
     <w:p>
@@ -6409,7 +6444,7 @@
         <w:spacing w:after="120" w:before="260"/>
       </w:pPr>
       <w:r>
-        <w:t xml:space="preserve">8.1  Historische Belege sind im Vollzugriff änderbar</w:t>
+        <w:t xml:space="preserve">8.1  Zusammenspiel von Berechtigungssatz und Codeunit</w:t>
       </w:r>
     </w:p>
     <w:p>
@@ -6426,7 +6461,43 @@
           <w:sz w:val="21"/>
           <w:szCs w:val="21"/>
         </w:rPr>
-        <w:t xml:space="preserve">PTE Sw. Sales GL vergibt auf PTE Posted Software Change das Recht RIMD. Gebuchte Softwareanpassungen sind damit für Key User änder- und löschbar, obwohl die Spezifikation festlegt, dass historische Belege nicht mehr verändert werden dürfen. Der Satz PTE Sw. Sales PO hält sich mit RI bereits daran.</w:t>
+        <w:t xml:space="preserve">Drei Tabellen dürfen nur von den Buchungsroutinen beschrieben werden. Umgesetzt ist das über das Zusammenspiel zweier Stellen:</w:t>
+      </w:r>
+    </w:p>
+    <w:p>
+      <w:pPr>
+        <w:pStyle w:val="ListParagraph"/>
+        <w:numPr>
+          <w:ilvl w:val="0"/>
+          <w:numId w:val="1"/>
+        </w:numPr>
+        <w:spacing w:after="80" w:line="276"/>
+      </w:pPr>
+      <w:r>
+        <w:rPr>
+          <w:rFonts w:ascii="Calibri" w:cs="Calibri" w:eastAsia="Calibri" w:hAnsi="Calibri"/>
+          <w:sz w:val="21"/>
+          <w:szCs w:val="21"/>
+        </w:rPr>
+        <w:t xml:space="preserve">Der Berechtigungssatz vergibt dem Benutzer nur ein indirektes Recht, erkennbar an der Kleinschreibung – etwa tabledata "PTE Posted Software Change" = Ri.</w:t>
+      </w:r>
+    </w:p>
+    <w:p>
+      <w:pPr>
+        <w:pStyle w:val="ListParagraph"/>
+        <w:numPr>
+          <w:ilvl w:val="0"/>
+          <w:numId w:val="1"/>
+        </w:numPr>
+        <w:spacing w:after="80" w:line="276"/>
+      </w:pPr>
+      <w:r>
+        <w:rPr>
+          <w:rFonts w:ascii="Calibri" w:cs="Calibri" w:eastAsia="Calibri" w:hAnsi="Calibri"/>
+          <w:sz w:val="21"/>
+          <w:szCs w:val="21"/>
+        </w:rPr>
+        <w:t xml:space="preserve">Die schreibende Codeunit bringt das direkte Recht über ihre Permissions-Eigenschaft mit, etwa Permissions = tabledata "PTE Posted Software Change" = RIMD in PTE Software Change-Post.</w:t>
       </w:r>
     </w:p>
     <w:p>
@@ -6436,14 +6507,14 @@
       <w:r>
         <w:rPr>
           <w:rFonts w:ascii="Calibri" w:cs="Calibri" w:eastAsia="Calibri" w:hAnsi="Calibri"/>
-          <w:b/>
-          <w:bCs/>
+          <w:b w:val="false"/>
+          <w:bCs w:val="false"/>
           <w:i w:val="false"/>
           <w:iCs w:val="false"/>
           <w:sz w:val="21"/>
           <w:szCs w:val="21"/>
         </w:rPr>
-        <w:t xml:space="preserve">Empfehlung: auf RI reduzieren, analog zum Provisionsposten.</w:t>
+        <w:t xml:space="preserve">Damit kann ein Benutzer den historischen Beleg erzeugen, solange er die Buchung anstößt – aber nicht auf anderem Weg. Wird die Codeunit umbenannt oder ihre Permissions-Eigenschaft entfernt, bricht die Buchung mit einem Berechtigungsfehler ab; beide Stellen gehören deshalb zusammen gepflegt.</w:t>
       </w:r>
     </w:p>
     <w:p>

</xml_diff>